<commit_message>
cambio de la documentacion
cambio de unas cosas chicas, pero en general estaba bien
</commit_message>
<xml_diff>
--- a/INFORMES/TP1_ProyectoMeteoro.docx
+++ b/INFORMES/TP1_ProyectoMeteoro.docx
@@ -4,7 +4,7 @@
   <w:body>
     <w:p>
       <w:pPr>
-        <w:pStyle w:val="Ttulo1"/>
+        <w:pStyle w:val="Heading1"/>
         <w:spacing w:line="249" w:lineRule="auto"/>
       </w:pPr>
       <w:r>
@@ -49,7 +49,7 @@
     </w:p>
     <w:p>
       <w:pPr>
-        <w:pStyle w:val="Textoindependiente"/>
+        <w:pStyle w:val="BodyText"/>
         <w:rPr>
           <w:b/>
         </w:rPr>
@@ -57,7 +57,7 @@
     </w:p>
     <w:p>
       <w:pPr>
-        <w:pStyle w:val="Textoindependiente"/>
+        <w:pStyle w:val="BodyText"/>
         <w:spacing w:before="56"/>
         <w:rPr>
           <w:b/>
@@ -66,7 +66,7 @@
     </w:p>
     <w:tbl>
       <w:tblPr>
-        <w:tblStyle w:val="TableNormal"/>
+        <w:tblStyle w:val="TableNormal1"/>
         <w:tblW w:w="0" w:type="auto"/>
         <w:tblInd w:w="2501" w:type="dxa"/>
         <w:tblLayout w:type="fixed"/>
@@ -166,14 +166,12 @@
                 <w:sz w:val="20"/>
               </w:rPr>
             </w:pPr>
-            <w:proofErr w:type="spellStart"/>
             <w:r>
               <w:rPr>
                 <w:sz w:val="20"/>
               </w:rPr>
               <w:t>Briasco</w:t>
             </w:r>
-            <w:proofErr w:type="spellEnd"/>
             <w:r>
               <w:rPr>
                 <w:spacing w:val="-10"/>
@@ -408,15 +406,15 @@
     </w:p>
     <w:p>
       <w:pPr>
-        <w:pStyle w:val="Textoindependiente"/>
-        <w:rPr>
-          <w:sz w:val="18"/>
-        </w:rPr>
-      </w:pPr>
-    </w:p>
-    <w:p>
-      <w:pPr>
-        <w:pStyle w:val="Textoindependiente"/>
+        <w:pStyle w:val="BodyText"/>
+        <w:rPr>
+          <w:sz w:val="18"/>
+        </w:rPr>
+      </w:pPr>
+    </w:p>
+    <w:p>
+      <w:pPr>
+        <w:pStyle w:val="BodyText"/>
         <w:spacing w:before="26"/>
         <w:rPr>
           <w:sz w:val="18"/>
@@ -599,15 +597,15 @@
     </w:p>
     <w:p>
       <w:pPr>
-        <w:pStyle w:val="Textoindependiente"/>
-        <w:rPr>
-          <w:sz w:val="18"/>
-        </w:rPr>
-      </w:pPr>
-    </w:p>
-    <w:p>
-      <w:pPr>
-        <w:pStyle w:val="Textoindependiente"/>
+        <w:pStyle w:val="BodyText"/>
+        <w:rPr>
+          <w:sz w:val="18"/>
+        </w:rPr>
+      </w:pPr>
+    </w:p>
+    <w:p>
+      <w:pPr>
+        <w:pStyle w:val="BodyText"/>
         <w:spacing w:before="195"/>
         <w:rPr>
           <w:sz w:val="18"/>
@@ -998,21 +996,7 @@
         <w:rPr>
           <w:sz w:val="18"/>
         </w:rPr>
-        <w:t xml:space="preserve">se activan alertas sonoras mediante un </w:t>
-      </w:r>
-      <w:proofErr w:type="spellStart"/>
-      <w:r>
-        <w:rPr>
-          <w:sz w:val="18"/>
-        </w:rPr>
-        <w:t>buzzer</w:t>
-      </w:r>
-      <w:proofErr w:type="spellEnd"/>
-      <w:r>
-        <w:rPr>
-          <w:sz w:val="18"/>
-        </w:rPr>
-        <w:t xml:space="preserve"> y mecanismos de vibración para alertar al conductor.</w:t>
+        <w:t>se activan alertas sonoras mediante un buzzer y mecanismos de vibración para alertar al conductor.</w:t>
       </w:r>
       <w:r>
         <w:rPr>
@@ -1030,7 +1014,7 @@
     </w:p>
     <w:p>
       <w:pPr>
-        <w:pStyle w:val="Textoindependiente"/>
+        <w:pStyle w:val="BodyText"/>
         <w:spacing w:before="14"/>
         <w:rPr>
           <w:sz w:val="18"/>
@@ -1050,21 +1034,7 @@
         <w:rPr>
           <w:sz w:val="18"/>
         </w:rPr>
-        <w:t xml:space="preserve">Como evolución del sistema, se ha integrado conectividad </w:t>
-      </w:r>
-      <w:proofErr w:type="spellStart"/>
-      <w:r>
-        <w:rPr>
-          <w:sz w:val="18"/>
-        </w:rPr>
-        <w:t>IoT</w:t>
-      </w:r>
-      <w:proofErr w:type="spellEnd"/>
-      <w:r>
-        <w:rPr>
-          <w:sz w:val="18"/>
-        </w:rPr>
-        <w:t xml:space="preserve"> mediante el protocolo MQTT. Esto permite la comunicación bidireccional en tiempo real con una aplicación Android, facilitando el monitoreo remoto del estado del conductor y permitiendo la activación de alarmas</w:t>
+        <w:t>Como evolución del sistema, se ha integrado conectividad IoT mediante el protocolo MQTT. Esto permite la comunicación bidireccional en tiempo real con una aplicación Android, facilitando el monitoreo remoto del estado del conductor y permitiendo la activación de alarmas</w:t>
       </w:r>
       <w:r>
         <w:rPr>
@@ -1258,15 +1228,15 @@
     </w:p>
     <w:p>
       <w:pPr>
-        <w:pStyle w:val="Textoindependiente"/>
-        <w:rPr>
-          <w:sz w:val="18"/>
-        </w:rPr>
-      </w:pPr>
-    </w:p>
-    <w:p>
-      <w:pPr>
-        <w:pStyle w:val="Textoindependiente"/>
+        <w:pStyle w:val="BodyText"/>
+        <w:rPr>
+          <w:sz w:val="18"/>
+        </w:rPr>
+      </w:pPr>
+    </w:p>
+    <w:p>
+      <w:pPr>
+        <w:pStyle w:val="BodyText"/>
         <w:spacing w:before="111"/>
         <w:rPr>
           <w:sz w:val="18"/>
@@ -1275,7 +1245,7 @@
     </w:p>
     <w:p>
       <w:pPr>
-        <w:pStyle w:val="Ttulo2"/>
+        <w:pStyle w:val="Heading2"/>
         <w:numPr>
           <w:ilvl w:val="0"/>
           <w:numId w:val="3"/>
@@ -1294,7 +1264,7 @@
     </w:p>
     <w:p>
       <w:pPr>
-        <w:pStyle w:val="Textoindependiente"/>
+        <w:pStyle w:val="BodyText"/>
         <w:spacing w:before="257"/>
         <w:rPr>
           <w:b/>
@@ -1304,7 +1274,7 @@
     </w:p>
     <w:p>
       <w:pPr>
-        <w:pStyle w:val="Textoindependiente"/>
+        <w:pStyle w:val="BodyText"/>
         <w:spacing w:before="1" w:line="249" w:lineRule="auto"/>
         <w:ind w:left="711" w:right="733"/>
         <w:jc w:val="both"/>
@@ -1315,13 +1285,13 @@
     </w:p>
     <w:p>
       <w:pPr>
-        <w:pStyle w:val="Textoindependiente"/>
+        <w:pStyle w:val="BodyText"/>
         <w:spacing w:before="55"/>
       </w:pPr>
     </w:p>
     <w:p>
       <w:pPr>
-        <w:pStyle w:val="Textoindependiente"/>
+        <w:pStyle w:val="BodyText"/>
         <w:spacing w:line="249" w:lineRule="auto"/>
         <w:ind w:left="711" w:right="732"/>
         <w:jc w:val="both"/>
@@ -1372,15 +1342,7 @@
         <w:t xml:space="preserve"> </w:t>
       </w:r>
       <w:r>
-        <w:t xml:space="preserve">identificar la presencia y la firmeza de las manos sobre el volante, integrados junto a un sensor magnético encargado de medir el movimiento </w:t>
-      </w:r>
-      <w:proofErr w:type="gramStart"/>
-      <w:r>
-        <w:t>del mismo</w:t>
-      </w:r>
-      <w:proofErr w:type="gramEnd"/>
-      <w:r>
-        <w:t>. Mediante una lógica basada en estados, la comparación con umbrales predefinidos y un control temporal para evitar falsos positivos, el sistema</w:t>
+        <w:t>identificar la presencia y la firmeza de las manos sobre el volante, integrados junto a un sensor magnético encargado de medir el movimiento del mismo. Mediante una lógica basada en estados, la comparación con umbrales predefinidos y un control temporal para evitar falsos positivos, el sistema</w:t>
       </w:r>
       <w:r>
         <w:rPr>
@@ -1425,6 +1387,36 @@
         <w:t xml:space="preserve"> </w:t>
       </w:r>
       <w:r>
+        <w:t xml:space="preserve">maniobras bruscas o leves </w:t>
+      </w:r>
+      <w:r>
+        <w:t>de</w:t>
+      </w:r>
+      <w:r>
+        <w:rPr>
+          <w:spacing w:val="-3"/>
+        </w:rPr>
+        <w:t xml:space="preserve"> </w:t>
+      </w:r>
+      <w:r>
+        <w:t>movimiento</w:t>
+      </w:r>
+      <w:r>
+        <w:rPr>
+          <w:spacing w:val="-3"/>
+        </w:rPr>
+        <w:t xml:space="preserve"> </w:t>
+      </w:r>
+      <w:r>
+        <w:t>o</w:t>
+      </w:r>
+      <w:r>
+        <w:rPr>
+          <w:spacing w:val="-3"/>
+        </w:rPr>
+        <w:t xml:space="preserve"> </w:t>
+      </w:r>
+      <w:r>
         <w:t>la</w:t>
       </w:r>
       <w:r>
@@ -1434,7 +1426,7 @@
         <w:t xml:space="preserve"> </w:t>
       </w:r>
       <w:r>
-        <w:t>ausencia</w:t>
+        <w:t>falta</w:t>
       </w:r>
       <w:r>
         <w:rPr>
@@ -1443,7 +1435,7 @@
         <w:t xml:space="preserve"> </w:t>
       </w:r>
       <w:r>
-        <w:t>prolongada</w:t>
+        <w:t>de</w:t>
       </w:r>
       <w:r>
         <w:rPr>
@@ -1452,7 +1444,7 @@
         <w:t xml:space="preserve"> </w:t>
       </w:r>
       <w:r>
-        <w:t>de</w:t>
+        <w:t>agarre—,</w:t>
       </w:r>
       <w:r>
         <w:rPr>
@@ -1461,7 +1453,7 @@
         <w:t xml:space="preserve"> </w:t>
       </w:r>
       <w:r>
-        <w:t>movimiento</w:t>
+        <w:t>el</w:t>
       </w:r>
       <w:r>
         <w:rPr>
@@ -1470,7 +1462,7 @@
         <w:t xml:space="preserve"> </w:t>
       </w:r>
       <w:r>
-        <w:t>o</w:t>
+        <w:t>sistema</w:t>
       </w:r>
       <w:r>
         <w:rPr>
@@ -1479,7 +1471,7 @@
         <w:t xml:space="preserve"> </w:t>
       </w:r>
       <w:r>
-        <w:t>la</w:t>
+        <w:t>asiste</w:t>
       </w:r>
       <w:r>
         <w:rPr>
@@ -1488,60 +1480,6 @@
         <w:t xml:space="preserve"> </w:t>
       </w:r>
       <w:r>
-        <w:t>falta</w:t>
-      </w:r>
-      <w:r>
-        <w:rPr>
-          <w:spacing w:val="-3"/>
-        </w:rPr>
-        <w:t xml:space="preserve"> </w:t>
-      </w:r>
-      <w:r>
-        <w:t>de</w:t>
-      </w:r>
-      <w:r>
-        <w:rPr>
-          <w:spacing w:val="-3"/>
-        </w:rPr>
-        <w:t xml:space="preserve"> </w:t>
-      </w:r>
-      <w:r>
-        <w:t>agarre—,</w:t>
-      </w:r>
-      <w:r>
-        <w:rPr>
-          <w:spacing w:val="-3"/>
-        </w:rPr>
-        <w:t xml:space="preserve"> </w:t>
-      </w:r>
-      <w:r>
-        <w:t>el</w:t>
-      </w:r>
-      <w:r>
-        <w:rPr>
-          <w:spacing w:val="-3"/>
-        </w:rPr>
-        <w:t xml:space="preserve"> </w:t>
-      </w:r>
-      <w:r>
-        <w:t>sistema</w:t>
-      </w:r>
-      <w:r>
-        <w:rPr>
-          <w:spacing w:val="-3"/>
-        </w:rPr>
-        <w:t xml:space="preserve"> </w:t>
-      </w:r>
-      <w:r>
-        <w:t>asiste</w:t>
-      </w:r>
-      <w:r>
-        <w:rPr>
-          <w:spacing w:val="-3"/>
-        </w:rPr>
-        <w:t xml:space="preserve"> </w:t>
-      </w:r>
-      <w:r>
         <w:t xml:space="preserve">en la prevención de accidentes activando de forma inmediata alertas sonoras y mecanismos de </w:t>
       </w:r>
       <w:r>
@@ -1553,7 +1491,7 @@
     </w:p>
     <w:p>
       <w:pPr>
-        <w:pStyle w:val="Textoindependiente"/>
+        <w:pStyle w:val="BodyText"/>
         <w:spacing w:line="249" w:lineRule="auto"/>
         <w:jc w:val="both"/>
         <w:sectPr>
@@ -1566,7 +1504,7 @@
     </w:p>
     <w:p>
       <w:pPr>
-        <w:pStyle w:val="Ttulo2"/>
+        <w:pStyle w:val="Heading2"/>
         <w:numPr>
           <w:ilvl w:val="0"/>
           <w:numId w:val="3"/>
@@ -1634,7 +1572,6 @@
           <w:sz w:val="24"/>
         </w:rPr>
       </w:pPr>
-      <w:proofErr w:type="gramStart"/>
       <w:r>
         <w:rPr>
           <w:b/>
@@ -1642,7 +1579,6 @@
         </w:rPr>
         <w:t>Link</w:t>
       </w:r>
-      <w:proofErr w:type="gramEnd"/>
       <w:r>
         <w:rPr>
           <w:b/>
@@ -1712,7 +1648,6 @@
         <w:t xml:space="preserve"> </w:t>
       </w:r>
       <w:hyperlink r:id="rId7">
-        <w:proofErr w:type="spellStart"/>
         <w:r>
           <w:rPr>
             <w:b/>
@@ -1722,7 +1657,6 @@
           </w:rPr>
           <w:t>Proyecto_Meteoro</w:t>
         </w:r>
-        <w:proofErr w:type="spellEnd"/>
         <w:r>
           <w:rPr>
             <w:b/>
@@ -1842,7 +1776,7 @@
     </w:p>
     <w:p>
       <w:pPr>
-        <w:pStyle w:val="Ttulo2"/>
+        <w:pStyle w:val="Heading2"/>
         <w:tabs>
           <w:tab w:val="left" w:pos="861"/>
         </w:tabs>
@@ -1856,7 +1790,7 @@
     </w:p>
     <w:p>
       <w:pPr>
-        <w:pStyle w:val="Ttulo2"/>
+        <w:pStyle w:val="Heading2"/>
         <w:tabs>
           <w:tab w:val="left" w:pos="861"/>
         </w:tabs>
@@ -1935,7 +1869,7 @@
     </w:p>
     <w:p>
       <w:pPr>
-        <w:pStyle w:val="Textoindependiente"/>
+        <w:pStyle w:val="BodyText"/>
         <w:rPr>
           <w:b/>
           <w:sz w:val="24"/>
@@ -1944,7 +1878,7 @@
     </w:p>
     <w:p>
       <w:pPr>
-        <w:pStyle w:val="Textoindependiente"/>
+        <w:pStyle w:val="BodyText"/>
         <w:rPr>
           <w:b/>
           <w:sz w:val="24"/>
@@ -1953,7 +1887,7 @@
     </w:p>
     <w:p>
       <w:pPr>
-        <w:pStyle w:val="Textoindependiente"/>
+        <w:pStyle w:val="BodyText"/>
         <w:rPr>
           <w:b/>
           <w:sz w:val="24"/>
@@ -1962,7 +1896,7 @@
     </w:p>
     <w:p>
       <w:pPr>
-        <w:pStyle w:val="Textoindependiente"/>
+        <w:pStyle w:val="BodyText"/>
         <w:rPr>
           <w:b/>
           <w:sz w:val="24"/>
@@ -1971,7 +1905,7 @@
     </w:p>
     <w:p>
       <w:pPr>
-        <w:pStyle w:val="Textoindependiente"/>
+        <w:pStyle w:val="BodyText"/>
         <w:rPr>
           <w:b/>
           <w:sz w:val="24"/>
@@ -1980,7 +1914,7 @@
     </w:p>
     <w:p>
       <w:pPr>
-        <w:pStyle w:val="Textoindependiente"/>
+        <w:pStyle w:val="BodyText"/>
         <w:rPr>
           <w:b/>
           <w:sz w:val="24"/>
@@ -1989,7 +1923,7 @@
     </w:p>
     <w:p>
       <w:pPr>
-        <w:pStyle w:val="Textoindependiente"/>
+        <w:pStyle w:val="BodyText"/>
         <w:rPr>
           <w:b/>
           <w:sz w:val="24"/>
@@ -1998,7 +1932,7 @@
     </w:p>
     <w:p>
       <w:pPr>
-        <w:pStyle w:val="Textoindependiente"/>
+        <w:pStyle w:val="BodyText"/>
         <w:rPr>
           <w:b/>
           <w:sz w:val="24"/>
@@ -2007,7 +1941,7 @@
     </w:p>
     <w:p>
       <w:pPr>
-        <w:pStyle w:val="Textoindependiente"/>
+        <w:pStyle w:val="BodyText"/>
         <w:rPr>
           <w:b/>
           <w:sz w:val="24"/>
@@ -2016,7 +1950,7 @@
     </w:p>
     <w:p>
       <w:pPr>
-        <w:pStyle w:val="Textoindependiente"/>
+        <w:pStyle w:val="BodyText"/>
         <w:rPr>
           <w:b/>
           <w:sz w:val="24"/>
@@ -2025,7 +1959,7 @@
     </w:p>
     <w:p>
       <w:pPr>
-        <w:pStyle w:val="Textoindependiente"/>
+        <w:pStyle w:val="BodyText"/>
         <w:rPr>
           <w:b/>
           <w:sz w:val="24"/>
@@ -2034,7 +1968,7 @@
     </w:p>
     <w:p>
       <w:pPr>
-        <w:pStyle w:val="Textoindependiente"/>
+        <w:pStyle w:val="BodyText"/>
         <w:rPr>
           <w:b/>
           <w:sz w:val="24"/>
@@ -2043,7 +1977,7 @@
     </w:p>
     <w:p>
       <w:pPr>
-        <w:pStyle w:val="Textoindependiente"/>
+        <w:pStyle w:val="BodyText"/>
         <w:rPr>
           <w:b/>
           <w:sz w:val="24"/>
@@ -2052,7 +1986,7 @@
     </w:p>
     <w:p>
       <w:pPr>
-        <w:pStyle w:val="Textoindependiente"/>
+        <w:pStyle w:val="BodyText"/>
         <w:rPr>
           <w:b/>
           <w:sz w:val="24"/>
@@ -2061,7 +1995,7 @@
     </w:p>
     <w:p>
       <w:pPr>
-        <w:pStyle w:val="Textoindependiente"/>
+        <w:pStyle w:val="BodyText"/>
         <w:rPr>
           <w:b/>
           <w:sz w:val="24"/>
@@ -2070,7 +2004,7 @@
     </w:p>
     <w:p>
       <w:pPr>
-        <w:pStyle w:val="Textoindependiente"/>
+        <w:pStyle w:val="BodyText"/>
         <w:rPr>
           <w:b/>
           <w:sz w:val="24"/>
@@ -2079,7 +2013,7 @@
     </w:p>
     <w:p>
       <w:pPr>
-        <w:pStyle w:val="Textoindependiente"/>
+        <w:pStyle w:val="BodyText"/>
         <w:rPr>
           <w:b/>
           <w:sz w:val="24"/>
@@ -2088,7 +2022,7 @@
     </w:p>
     <w:p>
       <w:pPr>
-        <w:pStyle w:val="Textoindependiente"/>
+        <w:pStyle w:val="BodyText"/>
         <w:rPr>
           <w:b/>
           <w:sz w:val="24"/>
@@ -2097,7 +2031,7 @@
     </w:p>
     <w:p>
       <w:pPr>
-        <w:pStyle w:val="Textoindependiente"/>
+        <w:pStyle w:val="BodyText"/>
         <w:rPr>
           <w:b/>
           <w:sz w:val="24"/>
@@ -2106,7 +2040,7 @@
     </w:p>
     <w:p>
       <w:pPr>
-        <w:pStyle w:val="Textoindependiente"/>
+        <w:pStyle w:val="BodyText"/>
         <w:rPr>
           <w:b/>
           <w:sz w:val="24"/>
@@ -2115,7 +2049,7 @@
     </w:p>
     <w:p>
       <w:pPr>
-        <w:pStyle w:val="Textoindependiente"/>
+        <w:pStyle w:val="BodyText"/>
         <w:rPr>
           <w:b/>
           <w:sz w:val="24"/>
@@ -2124,7 +2058,7 @@
     </w:p>
     <w:p>
       <w:pPr>
-        <w:pStyle w:val="Textoindependiente"/>
+        <w:pStyle w:val="BodyText"/>
         <w:spacing w:before="243"/>
         <w:rPr>
           <w:b/>
@@ -2134,7 +2068,7 @@
     </w:p>
     <w:p>
       <w:pPr>
-        <w:pStyle w:val="Ttulo2"/>
+        <w:pStyle w:val="Heading2"/>
       </w:pPr>
       <w:r>
         <w:rPr>
@@ -2205,42 +2139,37 @@
     </w:p>
     <w:p>
       <w:pPr>
-        <w:pStyle w:val="Ttulo2"/>
-      </w:pPr>
-    </w:p>
-    <w:p>
-      <w:pPr>
-        <w:pStyle w:val="Ttulo2"/>
-      </w:pPr>
-    </w:p>
-    <w:p>
-      <w:pPr>
-        <w:pStyle w:val="Ttulo2"/>
-      </w:pPr>
-      <w:r>
-        <w:t xml:space="preserve">Diagrama de navegación de </w:t>
-      </w:r>
-      <w:proofErr w:type="spellStart"/>
-      <w:r>
-        <w:t>Activitys</w:t>
-      </w:r>
-      <w:proofErr w:type="spellEnd"/>
-    </w:p>
-    <w:p>
-      <w:pPr>
-        <w:pStyle w:val="Ttulo2"/>
+        <w:pStyle w:val="Heading2"/>
+      </w:pPr>
+    </w:p>
+    <w:p>
+      <w:pPr>
+        <w:pStyle w:val="Heading2"/>
+      </w:pPr>
+    </w:p>
+    <w:p>
+      <w:pPr>
+        <w:pStyle w:val="Heading2"/>
+      </w:pPr>
+      <w:r>
+        <w:t>Diagrama de navegación de Activitys</w:t>
+      </w:r>
+    </w:p>
+    <w:p>
+      <w:pPr>
+        <w:pStyle w:val="Heading2"/>
         <w:ind w:left="0"/>
       </w:pPr>
     </w:p>
     <w:p>
       <w:pPr>
-        <w:pStyle w:val="Ttulo2"/>
+        <w:pStyle w:val="Heading2"/>
         <w:ind w:left="0"/>
       </w:pPr>
     </w:p>
     <w:p>
       <w:pPr>
-        <w:pStyle w:val="Ttulo2"/>
+        <w:pStyle w:val="Heading2"/>
         <w:ind w:left="0"/>
       </w:pPr>
       <w:r>
@@ -2287,7 +2216,7 @@
     </w:p>
     <w:p>
       <w:pPr>
-        <w:pStyle w:val="Ttulo2"/>
+        <w:pStyle w:val="Heading2"/>
         <w:ind w:left="0"/>
       </w:pPr>
     </w:p>
@@ -2359,7 +2288,7 @@
     </w:p>
     <w:p>
       <w:pPr>
-        <w:pStyle w:val="Textoindependiente"/>
+        <w:pStyle w:val="BodyText"/>
         <w:spacing w:before="14" w:line="249" w:lineRule="auto"/>
         <w:ind w:left="141" w:right="734"/>
         <w:jc w:val="both"/>
@@ -2427,13 +2356,13 @@
     </w:p>
     <w:p>
       <w:pPr>
-        <w:pStyle w:val="Textoindependiente"/>
+        <w:pStyle w:val="BodyText"/>
         <w:spacing w:before="11"/>
       </w:pPr>
     </w:p>
     <w:p>
       <w:pPr>
-        <w:pStyle w:val="Ttulo3"/>
+        <w:pStyle w:val="Heading3"/>
         <w:numPr>
           <w:ilvl w:val="0"/>
           <w:numId w:val="2"/>
@@ -2490,7 +2419,7 @@
     </w:p>
     <w:p>
       <w:pPr>
-        <w:pStyle w:val="Textoindependiente"/>
+        <w:pStyle w:val="BodyText"/>
         <w:spacing w:before="12"/>
         <w:ind w:left="141"/>
       </w:pPr>
@@ -2539,7 +2468,7 @@
     </w:p>
     <w:p>
       <w:pPr>
-        <w:pStyle w:val="Prrafodelista"/>
+        <w:pStyle w:val="ListParagraph"/>
         <w:numPr>
           <w:ilvl w:val="1"/>
           <w:numId w:val="2"/>
@@ -2682,7 +2611,7 @@
     </w:p>
     <w:p>
       <w:pPr>
-        <w:pStyle w:val="Prrafodelista"/>
+        <w:pStyle w:val="ListParagraph"/>
         <w:numPr>
           <w:ilvl w:val="1"/>
           <w:numId w:val="2"/>
@@ -2819,28 +2748,12 @@
           <w:spacing w:val="-2"/>
           <w:sz w:val="20"/>
         </w:rPr>
-        <w:t>(</w:t>
-      </w:r>
-      <w:proofErr w:type="spellStart"/>
-      <w:r>
-        <w:rPr>
-          <w:spacing w:val="-2"/>
-          <w:sz w:val="20"/>
-        </w:rPr>
-        <w:t>buzzer</w:t>
-      </w:r>
-      <w:proofErr w:type="spellEnd"/>
-      <w:r>
-        <w:rPr>
-          <w:spacing w:val="-2"/>
-          <w:sz w:val="20"/>
-        </w:rPr>
-        <w:t>/motor).</w:t>
-      </w:r>
-    </w:p>
-    <w:p>
-      <w:pPr>
-        <w:pStyle w:val="Prrafodelista"/>
+        <w:t>(buzzer/motor).</w:t>
+      </w:r>
+    </w:p>
+    <w:p>
+      <w:pPr>
+        <w:pStyle w:val="ListParagraph"/>
         <w:numPr>
           <w:ilvl w:val="1"/>
           <w:numId w:val="2"/>
@@ -2994,7 +2907,31 @@
     </w:p>
     <w:p>
       <w:pPr>
-        <w:pStyle w:val="Prrafodelista"/>
+        <w:pStyle w:val="ListParagraph"/>
+        <w:numPr>
+          <w:ilvl w:val="1"/>
+          <w:numId w:val="2"/>
+        </w:numPr>
+        <w:tabs>
+          <w:tab w:val="left" w:pos="861"/>
+        </w:tabs>
+        <w:ind w:left="861"/>
+        <w:rPr>
+          <w:rFonts w:ascii="Tahoma" w:hAnsi="Tahoma"/>
+          <w:sz w:val="20"/>
+        </w:rPr>
+      </w:pPr>
+      <w:r>
+        <w:rPr>
+          <w:spacing w:val="-2"/>
+          <w:sz w:val="20"/>
+        </w:rPr>
+        <w:t>Se inicializa la conexión de Wifi y la conexión MQTT.</w:t>
+      </w:r>
+    </w:p>
+    <w:p>
+      <w:pPr>
+        <w:pStyle w:val="ListParagraph"/>
         <w:numPr>
           <w:ilvl w:val="1"/>
           <w:numId w:val="2"/>
@@ -3170,7 +3107,7 @@
     </w:p>
     <w:p>
       <w:pPr>
-        <w:pStyle w:val="Textoindependiente"/>
+        <w:pStyle w:val="BodyText"/>
         <w:spacing w:before="201"/>
         <w:ind w:left="141"/>
       </w:pPr>
@@ -3255,13 +3192,13 @@
     </w:p>
     <w:p>
       <w:pPr>
-        <w:pStyle w:val="Textoindependiente"/>
+        <w:pStyle w:val="BodyText"/>
         <w:spacing w:before="19"/>
       </w:pPr>
     </w:p>
     <w:p>
       <w:pPr>
-        <w:pStyle w:val="Ttulo3"/>
+        <w:pStyle w:val="Heading3"/>
         <w:numPr>
           <w:ilvl w:val="0"/>
           <w:numId w:val="2"/>
@@ -3318,7 +3255,7 @@
     </w:p>
     <w:p>
       <w:pPr>
-        <w:pStyle w:val="Textoindependiente"/>
+        <w:pStyle w:val="BodyText"/>
         <w:spacing w:before="12"/>
         <w:ind w:left="141"/>
       </w:pPr>
@@ -3448,7 +3385,7 @@
     </w:p>
     <w:p>
       <w:pPr>
-        <w:pStyle w:val="Ttulo4"/>
+        <w:pStyle w:val="Heading4"/>
         <w:numPr>
           <w:ilvl w:val="1"/>
           <w:numId w:val="2"/>
@@ -3481,7 +3418,7 @@
     </w:p>
     <w:p>
       <w:pPr>
-        <w:pStyle w:val="Prrafodelista"/>
+        <w:pStyle w:val="ListParagraph"/>
         <w:numPr>
           <w:ilvl w:val="1"/>
           <w:numId w:val="2"/>
@@ -3522,7 +3459,7 @@
     </w:p>
     <w:p>
       <w:pPr>
-        <w:pStyle w:val="Textoindependiente"/>
+        <w:pStyle w:val="BodyText"/>
         <w:spacing w:before="210"/>
         <w:ind w:left="141"/>
       </w:pPr>
@@ -3679,7 +3616,7 @@
     </w:p>
     <w:p>
       <w:pPr>
-        <w:pStyle w:val="Prrafodelista"/>
+        <w:pStyle w:val="ListParagraph"/>
         <w:numPr>
           <w:ilvl w:val="1"/>
           <w:numId w:val="2"/>
@@ -3785,10 +3722,17 @@
         </w:rPr>
         <w:t>mínimo</w:t>
       </w:r>
-    </w:p>
-    <w:p>
-      <w:pPr>
-        <w:pStyle w:val="Prrafodelista"/>
+      <w:r>
+        <w:rPr>
+          <w:spacing w:val="-2"/>
+          <w:sz w:val="20"/>
+        </w:rPr>
+        <w:t xml:space="preserve"> de las dos manos</w:t>
+      </w:r>
+    </w:p>
+    <w:p>
+      <w:pPr>
+        <w:pStyle w:val="ListParagraph"/>
         <w:numPr>
           <w:ilvl w:val="1"/>
           <w:numId w:val="2"/>
@@ -3841,12 +3785,12 @@
           <w:spacing w:val="-2"/>
           <w:sz w:val="20"/>
         </w:rPr>
-        <w:t>moderada</w:t>
-      </w:r>
-    </w:p>
-    <w:p>
-      <w:pPr>
-        <w:pStyle w:val="Prrafodelista"/>
+        <w:t>por debajo del umbral de una mano</w:t>
+      </w:r>
+    </w:p>
+    <w:p>
+      <w:pPr>
+        <w:pStyle w:val="ListParagraph"/>
         <w:numPr>
           <w:ilvl w:val="1"/>
           <w:numId w:val="2"/>
@@ -3903,7 +3847,7 @@
     </w:p>
     <w:p>
       <w:pPr>
-        <w:pStyle w:val="Ttulo4"/>
+        <w:pStyle w:val="Heading4"/>
         <w:spacing w:before="210"/>
         <w:ind w:left="141" w:firstLine="0"/>
       </w:pPr>
@@ -3916,7 +3860,7 @@
     </w:p>
     <w:p>
       <w:pPr>
-        <w:pStyle w:val="Prrafodelista"/>
+        <w:pStyle w:val="ListParagraph"/>
         <w:numPr>
           <w:ilvl w:val="1"/>
           <w:numId w:val="2"/>
@@ -4070,7 +4014,7 @@
     </w:p>
     <w:p>
       <w:pPr>
-        <w:pStyle w:val="Prrafodelista"/>
+        <w:pStyle w:val="ListParagraph"/>
         <w:numPr>
           <w:ilvl w:val="1"/>
           <w:numId w:val="2"/>
@@ -4271,26 +4215,12 @@
         <w:rPr>
           <w:sz w:val="20"/>
         </w:rPr>
-        <w:t xml:space="preserve">falsas alarmas durante acciones normales, </w:t>
-      </w:r>
-      <w:proofErr w:type="gramStart"/>
-      <w:r>
-        <w:rPr>
-          <w:sz w:val="20"/>
-        </w:rPr>
-        <w:t>como</w:t>
-      </w:r>
-      <w:proofErr w:type="gramEnd"/>
-      <w:r>
-        <w:rPr>
-          <w:sz w:val="20"/>
-        </w:rPr>
-        <w:t xml:space="preserve"> por ejemplo, el cambio de marcha.</w:t>
-      </w:r>
-    </w:p>
-    <w:p>
-      <w:pPr>
-        <w:pStyle w:val="Textoindependiente"/>
+        <w:t>falsas alarmas durante acciones normales, como por ejemplo, el cambio de marcha.</w:t>
+      </w:r>
+    </w:p>
+    <w:p>
+      <w:pPr>
+        <w:pStyle w:val="BodyText"/>
         <w:spacing w:before="2"/>
         <w:ind w:left="861"/>
       </w:pPr>
@@ -4375,7 +4305,7 @@
     </w:p>
     <w:p>
       <w:pPr>
-        <w:pStyle w:val="Prrafodelista"/>
+        <w:pStyle w:val="ListParagraph"/>
         <w:numPr>
           <w:ilvl w:val="1"/>
           <w:numId w:val="2"/>
@@ -4504,7 +4434,7 @@
     </w:p>
     <w:p>
       <w:pPr>
-        <w:pStyle w:val="Textoindependiente"/>
+        <w:pStyle w:val="BodyText"/>
         <w:spacing w:before="210"/>
         <w:ind w:left="141"/>
       </w:pPr>
@@ -4616,7 +4546,7 @@
     </w:p>
     <w:p>
       <w:pPr>
-        <w:pStyle w:val="Ttulo3"/>
+        <w:pStyle w:val="Heading3"/>
         <w:numPr>
           <w:ilvl w:val="0"/>
           <w:numId w:val="2"/>
@@ -4674,7 +4604,7 @@
     </w:p>
     <w:p>
       <w:pPr>
-        <w:pStyle w:val="Textoindependiente"/>
+        <w:pStyle w:val="BodyText"/>
         <w:spacing w:before="12" w:line="249" w:lineRule="auto"/>
         <w:ind w:left="141" w:right="3861"/>
       </w:pPr>
@@ -4774,7 +4704,7 @@
     </w:p>
     <w:p>
       <w:pPr>
-        <w:pStyle w:val="Prrafodelista"/>
+        <w:pStyle w:val="ListParagraph"/>
         <w:numPr>
           <w:ilvl w:val="1"/>
           <w:numId w:val="2"/>
@@ -4851,7 +4781,7 @@
     </w:p>
     <w:p>
       <w:pPr>
-        <w:pStyle w:val="Prrafodelista"/>
+        <w:pStyle w:val="ListParagraph"/>
         <w:numPr>
           <w:ilvl w:val="1"/>
           <w:numId w:val="2"/>
@@ -4940,7 +4870,7 @@
     </w:p>
     <w:p>
       <w:pPr>
-        <w:pStyle w:val="Prrafodelista"/>
+        <w:pStyle w:val="ListParagraph"/>
         <w:numPr>
           <w:ilvl w:val="1"/>
           <w:numId w:val="2"/>
@@ -5164,7 +5094,7 @@
     </w:p>
     <w:p>
       <w:pPr>
-        <w:pStyle w:val="Prrafodelista"/>
+        <w:pStyle w:val="ListParagraph"/>
         <w:numPr>
           <w:ilvl w:val="1"/>
           <w:numId w:val="2"/>
@@ -5267,7 +5197,7 @@
     </w:p>
     <w:p>
       <w:pPr>
-        <w:pStyle w:val="Ttulo4"/>
+        <w:pStyle w:val="Heading4"/>
         <w:spacing w:before="210"/>
         <w:ind w:left="141" w:firstLine="0"/>
       </w:pPr>
@@ -5280,7 +5210,7 @@
     </w:p>
     <w:p>
       <w:pPr>
-        <w:pStyle w:val="Prrafodelista"/>
+        <w:pStyle w:val="ListParagraph"/>
         <w:numPr>
           <w:ilvl w:val="1"/>
           <w:numId w:val="2"/>
@@ -5382,7 +5312,7 @@
     </w:p>
     <w:p>
       <w:pPr>
-        <w:pStyle w:val="Prrafodelista"/>
+        <w:pStyle w:val="ListParagraph"/>
         <w:numPr>
           <w:ilvl w:val="1"/>
           <w:numId w:val="2"/>
@@ -5523,7 +5453,7 @@
     </w:p>
     <w:p>
       <w:pPr>
-        <w:pStyle w:val="Ttulo3"/>
+        <w:pStyle w:val="Heading3"/>
         <w:numPr>
           <w:ilvl w:val="0"/>
           <w:numId w:val="2"/>
@@ -5538,6 +5468,7 @@
       <w:bookmarkStart w:id="3" w:name="4.​Evaluación_de_condiciones_de_riesgo_"/>
       <w:bookmarkEnd w:id="3"/>
       <w:r>
+        <w:lastRenderedPageBreak/>
         <w:t>Evaluación</w:t>
       </w:r>
       <w:r>
@@ -5582,7 +5513,7 @@
     </w:p>
     <w:p>
       <w:pPr>
-        <w:pStyle w:val="Textoindependiente"/>
+        <w:pStyle w:val="BodyText"/>
         <w:spacing w:before="12" w:line="249" w:lineRule="auto"/>
         <w:ind w:left="141" w:right="733"/>
         <w:jc w:val="both"/>
@@ -5606,11 +5537,7 @@
         <w:t xml:space="preserve"> </w:t>
       </w:r>
       <w:r>
-        <w:t xml:space="preserve">falsas </w:t>
-      </w:r>
-      <w:r>
-        <w:lastRenderedPageBreak/>
-        <w:t>alarmas, se utiliza un</w:t>
+        <w:t>falsas alarmas, se utiliza un</w:t>
       </w:r>
       <w:r>
         <w:rPr>
@@ -5932,7 +5859,7 @@
     </w:p>
     <w:p>
       <w:pPr>
-        <w:pStyle w:val="Prrafodelista"/>
+        <w:pStyle w:val="ListParagraph"/>
         <w:numPr>
           <w:ilvl w:val="1"/>
           <w:numId w:val="2"/>
@@ -6022,7 +5949,7 @@
     </w:p>
     <w:p>
       <w:pPr>
-        <w:pStyle w:val="Prrafodelista"/>
+        <w:pStyle w:val="ListParagraph"/>
         <w:numPr>
           <w:ilvl w:val="1"/>
           <w:numId w:val="2"/>
@@ -6125,13 +6052,13 @@
     </w:p>
     <w:p>
       <w:pPr>
-        <w:pStyle w:val="Textoindependiente"/>
+        <w:pStyle w:val="BodyText"/>
         <w:spacing w:before="20"/>
       </w:pPr>
     </w:p>
     <w:p>
       <w:pPr>
-        <w:pStyle w:val="Textoindependiente"/>
+        <w:pStyle w:val="BodyText"/>
         <w:ind w:left="141"/>
       </w:pPr>
       <w:r>
@@ -6224,7 +6151,7 @@
     </w:p>
     <w:p>
       <w:pPr>
-        <w:pStyle w:val="Prrafodelista"/>
+        <w:pStyle w:val="ListParagraph"/>
         <w:numPr>
           <w:ilvl w:val="1"/>
           <w:numId w:val="2"/>
@@ -6397,7 +6324,7 @@
     </w:p>
     <w:p>
       <w:pPr>
-        <w:pStyle w:val="Prrafodelista"/>
+        <w:pStyle w:val="ListParagraph"/>
         <w:numPr>
           <w:ilvl w:val="1"/>
           <w:numId w:val="2"/>
@@ -6557,7 +6484,7 @@
     </w:p>
     <w:p>
       <w:pPr>
-        <w:pStyle w:val="Textoindependiente"/>
+        <w:pStyle w:val="BodyText"/>
         <w:ind w:left="141"/>
       </w:pPr>
       <w:r>
@@ -6677,12 +6604,12 @@
     </w:p>
     <w:p>
       <w:pPr>
-        <w:pStyle w:val="Textoindependiente"/>
-      </w:pPr>
-    </w:p>
-    <w:p>
-      <w:pPr>
-        <w:pStyle w:val="Ttulo3"/>
+        <w:pStyle w:val="BodyText"/>
+      </w:pPr>
+    </w:p>
+    <w:p>
+      <w:pPr>
+        <w:pStyle w:val="Heading3"/>
         <w:numPr>
           <w:ilvl w:val="0"/>
           <w:numId w:val="2"/>
@@ -6722,7 +6649,7 @@
     </w:p>
     <w:p>
       <w:pPr>
-        <w:pStyle w:val="Textoindependiente"/>
+        <w:pStyle w:val="BodyText"/>
         <w:spacing w:before="12"/>
         <w:ind w:left="141"/>
       </w:pPr>
@@ -6865,7 +6792,7 @@
     </w:p>
     <w:p>
       <w:pPr>
-        <w:pStyle w:val="Ttulo4"/>
+        <w:pStyle w:val="Heading4"/>
         <w:numPr>
           <w:ilvl w:val="1"/>
           <w:numId w:val="2"/>
@@ -6897,7 +6824,7 @@
     </w:p>
     <w:p>
       <w:pPr>
-        <w:pStyle w:val="Prrafodelista"/>
+        <w:pStyle w:val="ListParagraph"/>
         <w:numPr>
           <w:ilvl w:val="2"/>
           <w:numId w:val="2"/>
@@ -6984,7 +6911,7 @@
     </w:p>
     <w:p>
       <w:pPr>
-        <w:pStyle w:val="Prrafodelista"/>
+        <w:pStyle w:val="ListParagraph"/>
         <w:numPr>
           <w:ilvl w:val="2"/>
           <w:numId w:val="2"/>
@@ -7084,7 +7011,7 @@
     </w:p>
     <w:p>
       <w:pPr>
-        <w:pStyle w:val="Ttulo4"/>
+        <w:pStyle w:val="Heading4"/>
         <w:numPr>
           <w:ilvl w:val="1"/>
           <w:numId w:val="2"/>
@@ -7107,7 +7034,7 @@
     </w:p>
     <w:p>
       <w:pPr>
-        <w:pStyle w:val="Prrafodelista"/>
+        <w:pStyle w:val="ListParagraph"/>
         <w:numPr>
           <w:ilvl w:val="2"/>
           <w:numId w:val="2"/>
@@ -7197,14 +7124,12 @@
         </w:rPr>
         <w:t xml:space="preserve"> </w:t>
       </w:r>
-      <w:proofErr w:type="spellStart"/>
       <w:r>
         <w:rPr>
           <w:sz w:val="20"/>
         </w:rPr>
         <w:t>feedback</w:t>
       </w:r>
-      <w:proofErr w:type="spellEnd"/>
       <w:r>
         <w:rPr>
           <w:spacing w:val="-7"/>
@@ -7222,7 +7147,7 @@
     </w:p>
     <w:p>
       <w:pPr>
-        <w:pStyle w:val="Textoindependiente"/>
+        <w:pStyle w:val="BodyText"/>
         <w:spacing w:before="210"/>
         <w:ind w:left="141"/>
       </w:pPr>
@@ -7343,13 +7268,13 @@
     </w:p>
     <w:p>
       <w:pPr>
-        <w:pStyle w:val="Textoindependiente"/>
+        <w:pStyle w:val="BodyText"/>
         <w:spacing w:before="219"/>
       </w:pPr>
     </w:p>
     <w:p>
       <w:pPr>
-        <w:pStyle w:val="Ttulo3"/>
+        <w:pStyle w:val="Heading3"/>
         <w:numPr>
           <w:ilvl w:val="0"/>
           <w:numId w:val="2"/>
@@ -7406,7 +7331,7 @@
     </w:p>
     <w:p>
       <w:pPr>
-        <w:pStyle w:val="Textoindependiente"/>
+        <w:pStyle w:val="BodyText"/>
         <w:spacing w:before="12"/>
         <w:ind w:left="141"/>
       </w:pPr>
@@ -7500,7 +7425,7 @@
     </w:p>
     <w:p>
       <w:pPr>
-        <w:pStyle w:val="Prrafodelista"/>
+        <w:pStyle w:val="ListParagraph"/>
         <w:numPr>
           <w:ilvl w:val="1"/>
           <w:numId w:val="2"/>
@@ -7592,38 +7517,18 @@
         </w:rPr>
         <w:t xml:space="preserve"> </w:t>
       </w:r>
-      <w:proofErr w:type="spellStart"/>
-      <w:proofErr w:type="gramStart"/>
       <w:r>
         <w:rPr>
           <w:b/>
           <w:spacing w:val="-2"/>
           <w:sz w:val="20"/>
         </w:rPr>
-        <w:t>millis</w:t>
-      </w:r>
-      <w:proofErr w:type="spellEnd"/>
-      <w:r>
-        <w:rPr>
-          <w:b/>
-          <w:spacing w:val="-2"/>
-          <w:sz w:val="20"/>
-        </w:rPr>
-        <w:t>(</w:t>
-      </w:r>
-      <w:proofErr w:type="gramEnd"/>
-      <w:r>
-        <w:rPr>
-          <w:b/>
-          <w:spacing w:val="-2"/>
-          <w:sz w:val="20"/>
-        </w:rPr>
-        <w:t>)</w:t>
-      </w:r>
-    </w:p>
-    <w:p>
-      <w:pPr>
-        <w:pStyle w:val="Prrafodelista"/>
+        <w:t>millis()</w:t>
+      </w:r>
+    </w:p>
+    <w:p>
+      <w:pPr>
+        <w:pStyle w:val="ListParagraph"/>
         <w:numPr>
           <w:ilvl w:val="1"/>
           <w:numId w:val="2"/>
@@ -7736,7 +7641,6 @@
         </w:rPr>
         <w:t>(</w:t>
       </w:r>
-      <w:proofErr w:type="spellStart"/>
       <w:r>
         <w:rPr>
           <w:b/>
@@ -7745,7 +7649,6 @@
         </w:rPr>
         <w:t>timeout</w:t>
       </w:r>
-      <w:proofErr w:type="spellEnd"/>
       <w:r>
         <w:rPr>
           <w:spacing w:val="-2"/>
@@ -7756,7 +7659,7 @@
     </w:p>
     <w:p>
       <w:pPr>
-        <w:pStyle w:val="Prrafodelista"/>
+        <w:pStyle w:val="ListParagraph"/>
         <w:numPr>
           <w:ilvl w:val="1"/>
           <w:numId w:val="2"/>
@@ -7957,26 +7860,12 @@
         <w:rPr>
           <w:sz w:val="20"/>
         </w:rPr>
-        <w:t xml:space="preserve">alerta mediante eventos de </w:t>
-      </w:r>
-      <w:proofErr w:type="spellStart"/>
-      <w:r>
-        <w:rPr>
-          <w:sz w:val="20"/>
-        </w:rPr>
-        <w:t>timeout</w:t>
-      </w:r>
-      <w:proofErr w:type="spellEnd"/>
-      <w:r>
-        <w:rPr>
-          <w:sz w:val="20"/>
-        </w:rPr>
-        <w:t>, evitando alertas repetitivas o permanentes.</w:t>
-      </w:r>
-    </w:p>
-    <w:p>
-      <w:pPr>
-        <w:pStyle w:val="Textoindependiente"/>
+        <w:t>alerta mediante eventos de timeout, evitando alertas repetitivas o permanentes.</w:t>
+      </w:r>
+    </w:p>
+    <w:p>
+      <w:pPr>
+        <w:pStyle w:val="BodyText"/>
         <w:spacing w:before="201"/>
         <w:ind w:left="141"/>
       </w:pPr>
@@ -8052,7 +7941,7 @@
     </w:p>
     <w:p>
       <w:pPr>
-        <w:pStyle w:val="Ttulo3"/>
+        <w:pStyle w:val="Heading3"/>
         <w:numPr>
           <w:ilvl w:val="0"/>
           <w:numId w:val="2"/>
@@ -8101,7 +7990,7 @@
     </w:p>
     <w:p>
       <w:pPr>
-        <w:pStyle w:val="Textoindependiente"/>
+        <w:pStyle w:val="BodyText"/>
         <w:spacing w:before="12"/>
         <w:ind w:left="141"/>
       </w:pPr>
@@ -8186,7 +8075,7 @@
     </w:p>
     <w:p>
       <w:pPr>
-        <w:pStyle w:val="Prrafodelista"/>
+        <w:pStyle w:val="ListParagraph"/>
         <w:numPr>
           <w:ilvl w:val="1"/>
           <w:numId w:val="2"/>
@@ -8301,7 +8190,7 @@
     </w:p>
     <w:p>
       <w:pPr>
-        <w:pStyle w:val="Prrafodelista"/>
+        <w:pStyle w:val="ListParagraph"/>
         <w:numPr>
           <w:ilvl w:val="1"/>
           <w:numId w:val="2"/>
@@ -8443,7 +8332,7 @@
     </w:p>
     <w:p>
       <w:pPr>
-        <w:pStyle w:val="Ttulo3"/>
+        <w:pStyle w:val="Heading3"/>
         <w:numPr>
           <w:ilvl w:val="0"/>
           <w:numId w:val="2"/>
@@ -8483,7 +8372,7 @@
     </w:p>
     <w:p>
       <w:pPr>
-        <w:pStyle w:val="Prrafodelista"/>
+        <w:pStyle w:val="ListParagraph"/>
         <w:numPr>
           <w:ilvl w:val="1"/>
           <w:numId w:val="2"/>
@@ -8670,26 +8559,12 @@
         <w:rPr>
           <w:sz w:val="20"/>
         </w:rPr>
-        <w:t xml:space="preserve">conexión con la </w:t>
-      </w:r>
-      <w:proofErr w:type="gramStart"/>
-      <w:r>
-        <w:rPr>
-          <w:sz w:val="20"/>
-        </w:rPr>
-        <w:t>app</w:t>
-      </w:r>
-      <w:proofErr w:type="gramEnd"/>
-      <w:r>
-        <w:rPr>
-          <w:sz w:val="20"/>
-        </w:rPr>
-        <w:t>.</w:t>
-      </w:r>
-    </w:p>
-    <w:p>
-      <w:pPr>
-        <w:pStyle w:val="Prrafodelista"/>
+        <w:t>conexión con la app.</w:t>
+      </w:r>
+    </w:p>
+    <w:p>
+      <w:pPr>
+        <w:pStyle w:val="ListParagraph"/>
         <w:numPr>
           <w:ilvl w:val="1"/>
           <w:numId w:val="2"/>
@@ -8790,7 +8665,7 @@
     </w:p>
     <w:p>
       <w:pPr>
-        <w:pStyle w:val="Prrafodelista"/>
+        <w:pStyle w:val="ListParagraph"/>
         <w:numPr>
           <w:ilvl w:val="1"/>
           <w:numId w:val="2"/>
@@ -8954,7 +8829,7 @@
     </w:p>
     <w:p>
       <w:pPr>
-        <w:pStyle w:val="Textoindependiente"/>
+        <w:pStyle w:val="BodyText"/>
       </w:pPr>
     </w:p>
     <w:p>
@@ -8977,7 +8852,7 @@
     </w:p>
     <w:p>
       <w:pPr>
-        <w:pStyle w:val="Textoindependiente"/>
+        <w:pStyle w:val="BodyText"/>
         <w:spacing w:before="14" w:line="249" w:lineRule="auto"/>
         <w:ind w:left="141" w:right="734"/>
         <w:jc w:val="both"/>
@@ -8991,7 +8866,7 @@
     </w:p>
     <w:p>
       <w:pPr>
-        <w:pStyle w:val="Ttulo3"/>
+        <w:pStyle w:val="Heading3"/>
         <w:numPr>
           <w:ilvl w:val="0"/>
           <w:numId w:val="8"/>
@@ -9009,7 +8884,7 @@
     </w:p>
     <w:p>
       <w:pPr>
-        <w:pStyle w:val="Textoindependiente"/>
+        <w:pStyle w:val="BodyText"/>
         <w:numPr>
           <w:ilvl w:val="0"/>
           <w:numId w:val="9"/>
@@ -9018,45 +8893,27 @@
         <w:ind w:right="734"/>
         <w:jc w:val="both"/>
       </w:pPr>
-      <w:proofErr w:type="spellStart"/>
       <w:r>
         <w:rPr>
           <w:b/>
           <w:bCs/>
           <w:lang w:val="es-AR"/>
         </w:rPr>
-        <w:t>MainActivity</w:t>
-      </w:r>
-      <w:proofErr w:type="spellEnd"/>
-      <w:r>
-        <w:rPr>
-          <w:b/>
-          <w:bCs/>
+        <w:t>MainActivity (Pantalla Principal):</w:t>
+      </w:r>
+      <w:r>
+        <w:rPr>
           <w:lang w:val="es-AR"/>
         </w:rPr>
-        <w:t xml:space="preserve"> (Pantalla Principal):</w:t>
-      </w:r>
-      <w:r>
-        <w:rPr>
-          <w:lang w:val="es-AR"/>
-        </w:rPr>
-        <w:t xml:space="preserve"> </w:t>
-      </w:r>
-      <w:r>
-        <w:t xml:space="preserve">Es el panel que se abre al iniciar la </w:t>
-      </w:r>
-      <w:proofErr w:type="gramStart"/>
-      <w:r>
-        <w:t>app</w:t>
-      </w:r>
-      <w:proofErr w:type="gramEnd"/>
-      <w:r>
-        <w:t>. Desde acá el usuario puede monitorear en tiempo real el agarre de las manos, el giro del volante y el estado de alerta; también permite calibrar los umbrales de sensibilidad y activar un botón de pánico para disparar la alarma a distancia. Para navegar, se presiona el botón "Pantalla GPS", que abre la siguiente interfaz.</w:t>
-      </w:r>
-    </w:p>
-    <w:p>
-      <w:pPr>
-        <w:pStyle w:val="Textoindependiente"/>
+        <w:t xml:space="preserve"> </w:t>
+      </w:r>
+      <w:r>
+        <w:t>Es el panel que se abre al iniciar la app. Desde acá el usuario puede monitorear en tiempo real el agarre de las manos, el giro del volante y el estado de alerta; también permite calibrar los umbrales de sensibilidad y activar un botón de pánico para disparar la alarma a distancia. Para navegar, se presiona el botón "Pantalla GPS", que abre la siguiente interfaz.</w:t>
+      </w:r>
+    </w:p>
+    <w:p>
+      <w:pPr>
+        <w:pStyle w:val="BodyText"/>
         <w:numPr>
           <w:ilvl w:val="0"/>
           <w:numId w:val="9"/>
@@ -9065,28 +8922,18 @@
         <w:ind w:right="734"/>
         <w:jc w:val="both"/>
       </w:pPr>
-      <w:proofErr w:type="spellStart"/>
       <w:r>
         <w:rPr>
           <w:b/>
           <w:bCs/>
           <w:lang w:val="es-AR"/>
         </w:rPr>
-        <w:t>SecondActivity</w:t>
-      </w:r>
-      <w:proofErr w:type="spellEnd"/>
-      <w:r>
-        <w:rPr>
-          <w:b/>
-          <w:bCs/>
+        <w:t>SecondActivity (Pantalla GPS):</w:t>
+      </w:r>
+      <w:r>
+        <w:rPr>
           <w:lang w:val="es-AR"/>
         </w:rPr>
-        <w:t xml:space="preserve"> (Pantalla GPS):</w:t>
-      </w:r>
-      <w:r>
-        <w:rPr>
-          <w:lang w:val="es-AR"/>
-        </w:rPr>
         <w:t xml:space="preserve"> </w:t>
       </w:r>
       <w:r>
@@ -9096,33 +8943,12 @@
         <w:t xml:space="preserve"> </w:t>
       </w:r>
       <w:r>
-        <w:t xml:space="preserve">esto destruye la pantalla con un </w:t>
-      </w:r>
-      <w:proofErr w:type="spellStart"/>
-      <w:proofErr w:type="gramStart"/>
-      <w:r>
-        <w:t>finish</w:t>
-      </w:r>
-      <w:proofErr w:type="spellEnd"/>
-      <w:r>
-        <w:t>(</w:t>
-      </w:r>
-      <w:proofErr w:type="gramEnd"/>
-      <w:r>
-        <w:t xml:space="preserve">) y lo regresa a la </w:t>
-      </w:r>
-      <w:proofErr w:type="spellStart"/>
-      <w:r>
-        <w:t>MainActivity</w:t>
-      </w:r>
-      <w:proofErr w:type="spellEnd"/>
-      <w:r>
-        <w:t>.</w:t>
-      </w:r>
-    </w:p>
-    <w:p>
-      <w:pPr>
-        <w:pStyle w:val="Ttulo3"/>
+        <w:t>esto destruye la pantalla con un finish() y lo regresa a la MainActivity.</w:t>
+      </w:r>
+    </w:p>
+    <w:p>
+      <w:pPr>
+        <w:pStyle w:val="Heading3"/>
         <w:numPr>
           <w:ilvl w:val="0"/>
           <w:numId w:val="8"/>
@@ -9138,12 +8964,13 @@
         <w:rPr>
           <w:lang w:val="es-AR"/>
         </w:rPr>
+        <w:lastRenderedPageBreak/>
         <w:t>Guía de Uso de la Interfaz Móvil</w:t>
       </w:r>
     </w:p>
     <w:p>
       <w:pPr>
-        <w:pStyle w:val="Ttulo3"/>
+        <w:pStyle w:val="Heading3"/>
         <w:tabs>
           <w:tab w:val="left" w:pos="860"/>
         </w:tabs>
@@ -9155,7 +8982,6 @@
         <w:rPr>
           <w:lang w:val="es-AR"/>
         </w:rPr>
-        <w:lastRenderedPageBreak/>
         <w:tab/>
       </w:r>
       <w:r>
@@ -9167,7 +8993,7 @@
     </w:p>
     <w:p>
       <w:pPr>
-        <w:pStyle w:val="Textoindependiente"/>
+        <w:pStyle w:val="BodyText"/>
         <w:spacing w:line="249" w:lineRule="auto"/>
         <w:ind w:left="141" w:right="734"/>
         <w:jc w:val="both"/>
@@ -9179,23 +9005,15 @@
         <w:rPr>
           <w:lang w:val="es-AR"/>
         </w:rPr>
-        <w:t xml:space="preserve">pantalla </w:t>
-      </w:r>
-      <w:proofErr w:type="spellStart"/>
-      <w:r>
-        <w:rPr>
-          <w:lang w:val="es-AR"/>
-        </w:rPr>
-        <w:t>princip</w:t>
-      </w:r>
-      <w:proofErr w:type="spellEnd"/>
+        <w:t>pantalla princip</w:t>
+      </w:r>
       <w:r>
         <w:t>al decodifica constantemente las tramas JSON enviadas por el ESP32 a través del tópico volante/sensores. El usuario podrá visualizar en pantalla:</w:t>
       </w:r>
     </w:p>
     <w:p>
       <w:pPr>
-        <w:pStyle w:val="Textoindependiente"/>
+        <w:pStyle w:val="BodyText"/>
         <w:numPr>
           <w:ilvl w:val="0"/>
           <w:numId w:val="11"/>
@@ -9235,7 +9053,7 @@
     </w:p>
     <w:p>
       <w:pPr>
-        <w:pStyle w:val="Textoindependiente"/>
+        <w:pStyle w:val="BodyText"/>
         <w:numPr>
           <w:ilvl w:val="0"/>
           <w:numId w:val="11"/>
@@ -9264,7 +9082,7 @@
     </w:p>
     <w:p>
       <w:pPr>
-        <w:pStyle w:val="Textoindependiente"/>
+        <w:pStyle w:val="BodyText"/>
         <w:numPr>
           <w:ilvl w:val="0"/>
           <w:numId w:val="11"/>
@@ -9293,7 +9111,7 @@
     </w:p>
     <w:p>
       <w:pPr>
-        <w:pStyle w:val="Ttulo3"/>
+        <w:pStyle w:val="Heading3"/>
         <w:tabs>
           <w:tab w:val="left" w:pos="860"/>
         </w:tabs>
@@ -9316,7 +9134,7 @@
     </w:p>
     <w:p>
       <w:pPr>
-        <w:pStyle w:val="Textoindependiente"/>
+        <w:pStyle w:val="BodyText"/>
         <w:spacing w:line="249" w:lineRule="auto"/>
         <w:ind w:left="141" w:right="734"/>
         <w:jc w:val="both"/>
@@ -9327,7 +9145,7 @@
     </w:p>
     <w:p>
       <w:pPr>
-        <w:pStyle w:val="Textoindependiente"/>
+        <w:pStyle w:val="BodyText"/>
         <w:numPr>
           <w:ilvl w:val="0"/>
           <w:numId w:val="10"/>
@@ -9353,7 +9171,7 @@
     </w:p>
     <w:p>
       <w:pPr>
-        <w:pStyle w:val="Textoindependiente"/>
+        <w:pStyle w:val="BodyText"/>
         <w:numPr>
           <w:ilvl w:val="0"/>
           <w:numId w:val="10"/>
@@ -9379,7 +9197,7 @@
     </w:p>
     <w:p>
       <w:pPr>
-        <w:pStyle w:val="Textoindependiente"/>
+        <w:pStyle w:val="BodyText"/>
         <w:numPr>
           <w:ilvl w:val="0"/>
           <w:numId w:val="10"/>
@@ -9405,7 +9223,7 @@
     </w:p>
     <w:p>
       <w:pPr>
-        <w:pStyle w:val="Ttulo3"/>
+        <w:pStyle w:val="Heading3"/>
         <w:tabs>
           <w:tab w:val="left" w:pos="860"/>
         </w:tabs>
@@ -9422,7 +9240,7 @@
     </w:p>
     <w:p>
       <w:pPr>
-        <w:pStyle w:val="Textoindependiente"/>
+        <w:pStyle w:val="BodyText"/>
         <w:spacing w:line="249" w:lineRule="auto"/>
         <w:ind w:left="141" w:right="734"/>
         <w:jc w:val="both"/>
@@ -9431,32 +9249,18 @@
         <w:rPr>
           <w:lang w:val="es-AR"/>
         </w:rPr>
-        <w:t xml:space="preserve">La aplicación incorpora un botón de pánico de gran tamaño en la interfaz principal. Al ser pulsado, envía de manera inmediata la cadena "ALARMA" al módulo embebido. Esto fuerza una transición directa de la máquina de estados hacia ST_ALARMA_CELULAR, disparando al instante el </w:t>
-      </w:r>
-      <w:proofErr w:type="spellStart"/>
-      <w:r>
-        <w:rPr>
-          <w:lang w:val="es-AR"/>
-        </w:rPr>
-        <w:t>buzzer</w:t>
-      </w:r>
-      <w:proofErr w:type="spellEnd"/>
-      <w:r>
-        <w:rPr>
-          <w:lang w:val="es-AR"/>
-        </w:rPr>
-        <w:t xml:space="preserve"> continuo y el motor de vibración del vehículo para despabilar al conductor en caso de observar somnolencia desde un control remoto.</w:t>
-      </w:r>
-    </w:p>
-    <w:p>
-      <w:pPr>
-        <w:pStyle w:val="Textoindependiente"/>
+        <w:t>La aplicación incorpora un botón de pánico de gran tamaño en la interfaz principal. Al ser pulsado, envía de manera inmediata la cadena "ALARMA" al módulo embebido. Esto fuerza una transición directa de la máquina de estados hacia ST_ALARMA_CELULAR, disparando al instante el buzzer continuo y el motor de vibración del vehículo para despabilar al conductor en caso de observar somnolencia desde un control remoto.</w:t>
+      </w:r>
+    </w:p>
+    <w:p>
+      <w:pPr>
+        <w:pStyle w:val="BodyText"/>
         <w:spacing w:before="65"/>
       </w:pPr>
     </w:p>
     <w:p>
       <w:pPr>
-        <w:pStyle w:val="Textoindependiente"/>
+        <w:pStyle w:val="BodyText"/>
         <w:spacing w:before="246"/>
         <w:rPr>
           <w:b/>
@@ -9466,7 +9270,7 @@
     </w:p>
     <w:p>
       <w:pPr>
-        <w:pStyle w:val="Ttulo2"/>
+        <w:pStyle w:val="Heading2"/>
         <w:numPr>
           <w:ilvl w:val="0"/>
           <w:numId w:val="3"/>
@@ -9484,7 +9288,7 @@
     </w:p>
     <w:p>
       <w:pPr>
-        <w:pStyle w:val="Prrafodelista"/>
+        <w:pStyle w:val="ListParagraph"/>
         <w:numPr>
           <w:ilvl w:val="0"/>
           <w:numId w:val="1"/>
@@ -9702,7 +9506,7 @@
     </w:p>
     <w:p>
       <w:pPr>
-        <w:pStyle w:val="Textoindependiente"/>
+        <w:pStyle w:val="BodyText"/>
         <w:spacing w:before="2"/>
         <w:ind w:left="141"/>
       </w:pPr>
@@ -9725,13 +9529,13 @@
     </w:p>
     <w:p>
       <w:pPr>
-        <w:pStyle w:val="Textoindependiente"/>
+        <w:pStyle w:val="BodyText"/>
         <w:spacing w:before="20"/>
       </w:pPr>
     </w:p>
     <w:p>
       <w:pPr>
-        <w:pStyle w:val="Prrafodelista"/>
+        <w:pStyle w:val="ListParagraph"/>
         <w:numPr>
           <w:ilvl w:val="0"/>
           <w:numId w:val="1"/>
@@ -9864,13 +9668,13 @@
     </w:p>
     <w:p>
       <w:pPr>
-        <w:pStyle w:val="Textoindependiente"/>
+        <w:pStyle w:val="BodyText"/>
         <w:spacing w:before="21"/>
       </w:pPr>
     </w:p>
     <w:p>
       <w:pPr>
-        <w:pStyle w:val="Prrafodelista"/>
+        <w:pStyle w:val="ListParagraph"/>
         <w:numPr>
           <w:ilvl w:val="0"/>
           <w:numId w:val="1"/>
@@ -9942,7 +9746,6 @@
         </w:rPr>
         <w:t xml:space="preserve"> </w:t>
       </w:r>
-      <w:proofErr w:type="spellStart"/>
       <w:r>
         <w:rPr>
           <w:i/>
@@ -9950,7 +9753,6 @@
         </w:rPr>
         <w:t>Programming</w:t>
       </w:r>
-      <w:proofErr w:type="spellEnd"/>
       <w:r>
         <w:rPr>
           <w:i/>
@@ -10051,7 +9853,7 @@
     </w:p>
     <w:p>
       <w:pPr>
-        <w:pStyle w:val="Textoindependiente"/>
+        <w:pStyle w:val="BodyText"/>
         <w:spacing w:before="34"/>
         <w:rPr>
           <w:sz w:val="18"/>
@@ -10060,7 +9862,7 @@
     </w:p>
     <w:p>
       <w:pPr>
-        <w:pStyle w:val="Prrafodelista"/>
+        <w:pStyle w:val="ListParagraph"/>
         <w:numPr>
           <w:ilvl w:val="0"/>
           <w:numId w:val="1"/>
@@ -11901,7 +11703,7 @@
       <w:lang w:val="es-ES"/>
     </w:rPr>
   </w:style>
-  <w:style w:type="paragraph" w:styleId="Ttulo1">
+  <w:style w:type="paragraph" w:styleId="Heading1">
     <w:name w:val="heading 1"/>
     <w:basedOn w:val="Normal"/>
     <w:uiPriority w:val="9"/>
@@ -11918,7 +11720,7 @@
       <w:szCs w:val="28"/>
     </w:rPr>
   </w:style>
-  <w:style w:type="paragraph" w:styleId="Ttulo2">
+  <w:style w:type="paragraph" w:styleId="Heading2">
     <w:name w:val="heading 2"/>
     <w:basedOn w:val="Normal"/>
     <w:uiPriority w:val="9"/>
@@ -11935,7 +11737,7 @@
       <w:szCs w:val="24"/>
     </w:rPr>
   </w:style>
-  <w:style w:type="paragraph" w:styleId="Ttulo3">
+  <w:style w:type="paragraph" w:styleId="Heading3">
     <w:name w:val="heading 3"/>
     <w:basedOn w:val="Normal"/>
     <w:uiPriority w:val="9"/>
@@ -11950,7 +11752,7 @@
       <w:bCs/>
     </w:rPr>
   </w:style>
-  <w:style w:type="paragraph" w:styleId="Ttulo4">
+  <w:style w:type="paragraph" w:styleId="Heading4">
     <w:name w:val="heading 4"/>
     <w:basedOn w:val="Normal"/>
     <w:uiPriority w:val="9"/>
@@ -11968,13 +11770,13 @@
       <w:szCs w:val="20"/>
     </w:rPr>
   </w:style>
-  <w:style w:type="character" w:default="1" w:styleId="Fuentedeprrafopredeter">
+  <w:style w:type="character" w:default="1" w:styleId="DefaultParagraphFont">
     <w:name w:val="Default Paragraph Font"/>
     <w:uiPriority w:val="1"/>
     <w:semiHidden/>
     <w:unhideWhenUsed/>
   </w:style>
-  <w:style w:type="table" w:default="1" w:styleId="Tablanormal">
+  <w:style w:type="table" w:default="1" w:styleId="TableNormal">
     <w:name w:val="Normal Table"/>
     <w:uiPriority w:val="99"/>
     <w:semiHidden/>
@@ -11989,14 +11791,14 @@
       </w:tblCellMar>
     </w:tblPr>
   </w:style>
-  <w:style w:type="numbering" w:default="1" w:styleId="Sinlista">
+  <w:style w:type="numbering" w:default="1" w:styleId="NoList">
     <w:name w:val="No List"/>
     <w:uiPriority w:val="99"/>
     <w:semiHidden/>
     <w:unhideWhenUsed/>
   </w:style>
-  <w:style w:type="table" w:customStyle="1" w:styleId="TableNormal">
-    <w:name w:val="Table Normal"/>
+  <w:style w:type="table" w:customStyle="1" w:styleId="TableNormal1">
+    <w:name w:val="Table Normal1"/>
     <w:uiPriority w:val="2"/>
     <w:semiHidden/>
     <w:unhideWhenUsed/>
@@ -12011,7 +11813,7 @@
       </w:tblCellMar>
     </w:tblPr>
   </w:style>
-  <w:style w:type="paragraph" w:styleId="Textoindependiente">
+  <w:style w:type="paragraph" w:styleId="BodyText">
     <w:name w:val="Body Text"/>
     <w:basedOn w:val="Normal"/>
     <w:uiPriority w:val="1"/>
@@ -12021,7 +11823,7 @@
       <w:szCs w:val="20"/>
     </w:rPr>
   </w:style>
-  <w:style w:type="paragraph" w:styleId="Prrafodelista">
+  <w:style w:type="paragraph" w:styleId="ListParagraph">
     <w:name w:val="List Paragraph"/>
     <w:basedOn w:val="Normal"/>
     <w:uiPriority w:val="1"/>
@@ -12041,9 +11843,9 @@
       <w:ind w:left="50"/>
     </w:pPr>
   </w:style>
-  <w:style w:type="character" w:styleId="Hipervnculo">
+  <w:style w:type="character" w:styleId="Hyperlink">
     <w:name w:val="Hyperlink"/>
-    <w:basedOn w:val="Fuentedeprrafopredeter"/>
+    <w:basedOn w:val="DefaultParagraphFont"/>
     <w:uiPriority w:val="99"/>
     <w:unhideWhenUsed/>
     <w:rsid w:val="000618AF"/>
@@ -12052,9 +11854,9 @@
       <w:u w:val="single"/>
     </w:rPr>
   </w:style>
-  <w:style w:type="character" w:styleId="Mencinsinresolver">
+  <w:style w:type="character" w:styleId="UnresolvedMention">
     <w:name w:val="Unresolved Mention"/>
-    <w:basedOn w:val="Fuentedeprrafopredeter"/>
+    <w:basedOn w:val="DefaultParagraphFont"/>
     <w:uiPriority w:val="99"/>
     <w:semiHidden/>
     <w:unhideWhenUsed/>

</xml_diff>